<commit_message>
skill: regenerate samples — flow.png + comprehensive Sample_SOW.docx
Sample_SOW.docx now ~181KB (2 diagrams + governance/timeline/RACI/SLAs/
entitlements/BOM tables); add flow.png; tech-design embeds both diagrams; deck +
spec.json/pricing.json refreshed. samples/README updated.

Co-Authored-By: Claude Opus 4.8 <noreply@anthropic.com>
</commit_message>
<xml_diff>
--- a/deliverables/samples/Sample_SOW.docx
+++ b/deliverables/samples/Sample_SOW.docx
@@ -26,7 +26,12 @@
           <w:sz w:val="22"/>
           <w:rFonts w:ascii="Calibri" w:hAnsi="Calibri"/>
         </w:rPr>
-        <w:t xml:space="preserve">EBS AP Invoice Automation Agent · Syntax Corporation</w:t>
+        <w:t xml:space="preserve">EBS AP Invoice Automation Agent · Syntax Corporation · Syntax Corporation © 2026 · Confidential</w:t>
+      </w:r>
+    </w:p>
+    <w:p>
+      <w:r>
+        <w:br w:type="page"/>
       </w:r>
     </w:p>
     <w:p>
@@ -40,7 +45,7 @@
           <w:sz w:val="30"/>
           <w:rFonts w:ascii="Calibri" w:hAnsi="Calibri"/>
         </w:rPr>
-        <w:t xml:space="preserve">1. Overview &amp; scope</w:t>
+        <w:t xml:space="preserve">1. Business problem</w:t>
       </w:r>
     </w:p>
     <w:p>
@@ -53,7 +58,58 @@
           <w:sz w:val="22"/>
           <w:rFonts w:ascii="Calibri" w:hAnsi="Calibri"/>
         </w:rPr>
-        <w:t xml:space="preserve">Syntax will implement the EBS AP Invoice Automation Agent on Oracle Private Agent Factory, integrating to the customer's EBS 19c via the OCI Database Tools Managed MCP, with deterministic 3-way match, GL/tax coding, QA, and load through the standard Payables Open Interface Import.</w:t>
+        <w:t xml:space="preserve">AP automation is a $3B+ category with multiple unicorns. Every EBS shop runs tens of thousands to millions of invoices a year — and pays incumbents $3–8 each.</w:t>
+      </w:r>
+    </w:p>
+    <w:p>
+      <w:pPr>
+        <w:numPr>
+          <w:ilvl w:val="0"/>
+          <w:numId w:val="1"/>
+        </w:numPr>
+        <w:spacing w:after="60"/>
+      </w:pPr>
+      <w:r>
+        <w:rPr>
+          <w:color w:val="16203A"/>
+          <w:sz w:val="22"/>
+          <w:rFonts w:ascii="Calibri" w:hAnsi="Calibri"/>
+        </w:rPr>
+        <w:t xml:space="preserve">$12–15 — fully-loaded cost to process one invoice by hand</w:t>
+      </w:r>
+    </w:p>
+    <w:p>
+      <w:pPr>
+        <w:numPr>
+          <w:ilvl w:val="0"/>
+          <w:numId w:val="1"/>
+        </w:numPr>
+        <w:spacing w:after="60"/>
+      </w:pPr>
+      <w:r>
+        <w:rPr>
+          <w:color w:val="16203A"/>
+          <w:sz w:val="22"/>
+          <w:rFonts w:ascii="Calibri" w:hAnsi="Calibri"/>
+        </w:rPr>
+        <w:t xml:space="preserve">8–10 days — typical cycle time — late payments, missed discounts</w:t>
+      </w:r>
+    </w:p>
+    <w:p>
+      <w:pPr>
+        <w:numPr>
+          <w:ilvl w:val="0"/>
+          <w:numId w:val="1"/>
+        </w:numPr>
+        <w:spacing w:after="60"/>
+      </w:pPr>
+      <w:r>
+        <w:rPr>
+          <w:color w:val="16203A"/>
+          <w:sz w:val="22"/>
+          <w:rFonts w:ascii="Calibri" w:hAnsi="Calibri"/>
+        </w:rPr>
+        <w:t xml:space="preserve">1–3% — of spend lost to duplicate and over-billed invoices</w:t>
       </w:r>
     </w:p>
     <w:p>
@@ -67,7 +123,197 @@
           <w:sz w:val="30"/>
           <w:rFonts w:ascii="Calibri" w:hAnsi="Calibri"/>
         </w:rPr>
-        <w:t xml:space="preserve">2. Architecture</w:t>
+        <w:t xml:space="preserve">2. Solution</w:t>
+      </w:r>
+    </w:p>
+    <w:p>
+      <w:pPr>
+        <w:numPr>
+          <w:ilvl w:val="0"/>
+          <w:numId w:val="1"/>
+        </w:numPr>
+        <w:spacing w:after="60"/>
+      </w:pPr>
+      <w:r>
+        <w:rPr>
+          <w:color w:val="16203A"/>
+          <w:sz w:val="22"/>
+          <w:rFonts w:ascii="Calibri" w:hAnsi="Calibri"/>
+        </w:rPr>
+        <w:t xml:space="preserve">Reads any invoice: PDF, email or text — a deterministic parser (zero external deps) with an optional LLM for messy/scanned docs.</w:t>
+      </w:r>
+    </w:p>
+    <w:p>
+      <w:pPr>
+        <w:numPr>
+          <w:ilvl w:val="0"/>
+          <w:numId w:val="1"/>
+        </w:numPr>
+        <w:spacing w:after="60"/>
+      </w:pPr>
+      <w:r>
+        <w:rPr>
+          <w:color w:val="16203A"/>
+          <w:sz w:val="22"/>
+          <w:rFonts w:ascii="Calibri" w:hAnsi="Calibri"/>
+        </w:rPr>
+        <w:t xml:space="preserve">Checks live EBS: Supplier, PO, receipts, tax and GL — read-only, org-scoped lookups against the real E-Business Suite.</w:t>
+      </w:r>
+    </w:p>
+    <w:p>
+      <w:pPr>
+        <w:numPr>
+          <w:ilvl w:val="0"/>
+          <w:numId w:val="1"/>
+        </w:numPr>
+        <w:spacing w:after="60"/>
+      </w:pPr>
+      <w:r>
+        <w:rPr>
+          <w:color w:val="16203A"/>
+          <w:sz w:val="22"/>
+          <w:rFonts w:ascii="Calibri" w:hAnsi="Calibri"/>
+        </w:rPr>
+        <w:t xml:space="preserve">Matches &amp; codes: Deterministic 3-way match with price/qty tolerances, GL distribution inheritance and tax classification.</w:t>
+      </w:r>
+    </w:p>
+    <w:p>
+      <w:pPr>
+        <w:numPr>
+          <w:ilvl w:val="0"/>
+          <w:numId w:val="1"/>
+        </w:numPr>
+        <w:spacing w:after="60"/>
+      </w:pPr>
+      <w:r>
+        <w:rPr>
+          <w:color w:val="16203A"/>
+          <w:sz w:val="22"/>
+          <w:rFonts w:ascii="Calibri" w:hAnsi="Calibri"/>
+        </w:rPr>
+        <w:t xml:space="preserve">Validates &amp; delivers: A QA gate proves every invoice balances before it writes balanced AP Open Interface files.</w:t>
+      </w:r>
+    </w:p>
+    <w:p>
+      <w:pPr>
+        <w:spacing w:after="120"/>
+      </w:pPr>
+      <w:r>
+        <w:rPr>
+          <w:color w:val="16203A"/>
+          <w:sz w:val="22"/>
+          <w:rFonts w:ascii="Calibri" w:hAnsi="Calibri"/>
+        </w:rPr>
+        <w:t xml:space="preserve">Same agentic pattern as Oracle's Private Agent Factory contract-renewal blog — pointed at the far larger AP revenue pool.</w:t>
+      </w:r>
+    </w:p>
+    <w:p>
+      <w:pPr>
+        <w:spacing w:after="120"/>
+      </w:pPr>
+      <w:r>
+        <w:rPr>
+          <w:b/>
+          <w:color w:val="0632A0"/>
+          <w:sz w:val="30"/>
+          <w:rFonts w:ascii="Calibri" w:hAnsi="Calibri"/>
+        </w:rPr>
+        <w:t xml:space="preserve">3. Value proposition</w:t>
+      </w:r>
+    </w:p>
+    <w:p>
+      <w:pPr>
+        <w:spacing w:after="120"/>
+      </w:pPr>
+      <w:r>
+        <w:rPr>
+          <w:color w:val="16203A"/>
+          <w:sz w:val="22"/>
+          <w:rFonts w:ascii="Calibri" w:hAnsi="Calibri"/>
+        </w:rPr>
+        <w:t xml:space="preserve">Estimated annual value ~$930,000; first-year net ~$822,520; payback ~1.4 months; 20–40× return on the agent fee.</w:t>
+      </w:r>
+    </w:p>
+    <w:p>
+      <w:pPr>
+        <w:numPr>
+          <w:ilvl w:val="0"/>
+          <w:numId w:val="1"/>
+        </w:numPr>
+        <w:spacing w:after="60"/>
+      </w:pPr>
+      <w:r>
+        <w:rPr>
+          <w:color w:val="16203A"/>
+          <w:sz w:val="22"/>
+          <w:rFonts w:ascii="Calibri" w:hAnsi="Calibri"/>
+        </w:rPr>
+        <w:t xml:space="preserve">Processing cost: $475K / yr</w:t>
+      </w:r>
+    </w:p>
+    <w:p>
+      <w:pPr>
+        <w:numPr>
+          <w:ilvl w:val="0"/>
+          <w:numId w:val="1"/>
+        </w:numPr>
+        <w:spacing w:after="60"/>
+      </w:pPr>
+      <w:r>
+        <w:rPr>
+          <w:color w:val="16203A"/>
+          <w:sz w:val="22"/>
+          <w:rFonts w:ascii="Calibri" w:hAnsi="Calibri"/>
+        </w:rPr>
+        <w:t xml:space="preserve">Early-pay discounts: $225K / yr</w:t>
+      </w:r>
+    </w:p>
+    <w:p>
+      <w:pPr>
+        <w:numPr>
+          <w:ilvl w:val="0"/>
+          <w:numId w:val="1"/>
+        </w:numPr>
+        <w:spacing w:after="60"/>
+      </w:pPr>
+      <w:r>
+        <w:rPr>
+          <w:color w:val="16203A"/>
+          <w:sz w:val="22"/>
+          <w:rFonts w:ascii="Calibri" w:hAnsi="Calibri"/>
+        </w:rPr>
+        <w:t xml:space="preserve">Duplicate prevention: $150K / yr</w:t>
+      </w:r>
+    </w:p>
+    <w:p>
+      <w:pPr>
+        <w:numPr>
+          <w:ilvl w:val="0"/>
+          <w:numId w:val="1"/>
+        </w:numPr>
+        <w:spacing w:after="60"/>
+      </w:pPr>
+      <w:r>
+        <w:rPr>
+          <w:color w:val="16203A"/>
+          <w:sz w:val="22"/>
+          <w:rFonts w:ascii="Calibri" w:hAnsi="Calibri"/>
+        </w:rPr>
+        <w:t xml:space="preserve">Audit / compliance: $80K / yr</w:t>
+      </w:r>
+    </w:p>
+    <w:p>
+      <w:pPr>
+        <w:spacing w:after="120"/>
+      </w:pPr>
+      <w:r>
+        <w:rPr>
+          <w:b/>
+          <w:color w:val="0632A0"/>
+          <w:sz w:val="30"/>
+          <w:rFonts w:ascii="Calibri" w:hAnsi="Calibri"/>
+        </w:rPr>
+        <w:t xml:space="preserve">4. Functional flow</w:t>
       </w:r>
     </w:p>
     <w:p>
@@ -120,7 +366,60 @@
           <w:sz w:val="30"/>
           <w:rFonts w:ascii="Calibri" w:hAnsi="Calibri"/>
         </w:rPr>
-        <w:t xml:space="preserve">3. Deliverables</w:t>
+        <w:t xml:space="preserve">5. Technical architecture</w:t>
+      </w:r>
+    </w:p>
+    <w:p>
+      <w:pPr>
+        <w:jc w:val="center"/>
+        <w:spacing w:after="160"/>
+      </w:pPr>
+      <w:r>
+        <w:drawing>
+          <wp:inline distT="0" distB="0" distL="0" distR="0">
+            <wp:extent cx="5669280" cy="3188970"/>
+            <wp:docPr id="1" name="Architecture"/>
+            <a:graphic xmlns:a="http://schemas.openxmlformats.org/drawingml/2006/main">
+              <a:graphicData uri="http://schemas.openxmlformats.org/drawingml/2006/picture">
+                <pic:pic xmlns:pic="http://schemas.openxmlformats.org/drawingml/2006/picture">
+                  <pic:nvPicPr>
+                    <pic:cNvPr id="1" name="Architecture"/>
+                    <pic:cNvPicPr/>
+                  </pic:nvPicPr>
+                  <pic:blipFill>
+                    <a:blip r:embed="rId101"/>
+                    <a:stretch>
+                      <a:fillRect/>
+                    </a:stretch>
+                  </pic:blipFill>
+                  <pic:spPr>
+                    <a:xfrm>
+                      <a:off x="0" y="0"/>
+                      <a:ext cx="5669280" cy="3188970"/>
+                    </a:xfrm>
+                    <a:prstGeom prst="rect">
+                      <a:avLst/>
+                    </a:prstGeom>
+                  </pic:spPr>
+                </pic:pic>
+              </a:graphicData>
+            </a:graphic>
+          </wp:inline>
+        </w:drawing>
+      </w:r>
+    </w:p>
+    <w:p>
+      <w:pPr>
+        <w:spacing w:after="120"/>
+      </w:pPr>
+      <w:r>
+        <w:rPr>
+          <w:b/>
+          <w:color w:val="0632A0"/>
+          <w:sz w:val="30"/>
+          <w:rFonts w:ascii="Calibri" w:hAnsi="Calibri"/>
+        </w:rPr>
+        <w:t xml:space="preserve">6. Scope &amp; deliverables</w:t>
       </w:r>
     </w:p>
     <w:p>
@@ -202,7 +501,531 @@
           <w:sz w:val="30"/>
           <w:rFonts w:ascii="Calibri" w:hAnsi="Calibri"/>
         </w:rPr>
-        <w:t xml:space="preserve">4. Responsibilities (RACI summary)</w:t>
+        <w:t xml:space="preserve">7. Ongoing governance deliverables</w:t>
+      </w:r>
+    </w:p>
+    <w:p>
+      <w:pPr>
+        <w:numPr>
+          <w:ilvl w:val="0"/>
+          <w:numId w:val="1"/>
+        </w:numPr>
+        <w:spacing w:after="60"/>
+      </w:pPr>
+      <w:r>
+        <w:rPr>
+          <w:color w:val="16203A"/>
+          <w:sz w:val="22"/>
+          <w:rFonts w:ascii="Calibri" w:hAnsi="Calibri"/>
+        </w:rPr>
+        <w:t xml:space="preserve">KPI / monitoring dashboard (throughput, STP %, exception rate) via the published REST API</w:t>
+      </w:r>
+    </w:p>
+    <w:p>
+      <w:pPr>
+        <w:numPr>
+          <w:ilvl w:val="0"/>
+          <w:numId w:val="1"/>
+        </w:numPr>
+        <w:spacing w:after="60"/>
+      </w:pPr>
+      <w:r>
+        <w:rPr>
+          <w:color w:val="16203A"/>
+          <w:sz w:val="22"/>
+          <w:rFonts w:ascii="Calibri" w:hAnsi="Calibri"/>
+        </w:rPr>
+        <w:t xml:space="preserve">Exception-review console for HOLD / needs-approval invoices (human-in-the-loop)</w:t>
+      </w:r>
+    </w:p>
+    <w:p>
+      <w:pPr>
+        <w:numPr>
+          <w:ilvl w:val="0"/>
+          <w:numId w:val="1"/>
+        </w:numPr>
+        <w:spacing w:after="60"/>
+      </w:pPr>
+      <w:r>
+        <w:rPr>
+          <w:color w:val="16203A"/>
+          <w:sz w:val="22"/>
+          <w:rFonts w:ascii="Calibri" w:hAnsi="Calibri"/>
+        </w:rPr>
+        <w:t xml:space="preserve">Model &amp; prompt management — versioned prompts, model pinning, regression checks</w:t>
+      </w:r>
+    </w:p>
+    <w:p>
+      <w:pPr>
+        <w:numPr>
+          <w:ilvl w:val="0"/>
+          <w:numId w:val="1"/>
+        </w:numPr>
+        <w:spacing w:after="60"/>
+      </w:pPr>
+      <w:r>
+        <w:rPr>
+          <w:color w:val="16203A"/>
+          <w:sz w:val="22"/>
+          <w:rFonts w:ascii="Calibri" w:hAnsi="Calibri"/>
+        </w:rPr>
+        <w:t xml:space="preserve">Periodic accuracy review — re-run the validation gate on a sampled set each quarter</w:t>
+      </w:r>
+    </w:p>
+    <w:p>
+      <w:pPr>
+        <w:numPr>
+          <w:ilvl w:val="0"/>
+          <w:numId w:val="1"/>
+        </w:numPr>
+        <w:spacing w:after="60"/>
+      </w:pPr>
+      <w:r>
+        <w:rPr>
+          <w:color w:val="16203A"/>
+          <w:sz w:val="22"/>
+          <w:rFonts w:ascii="Calibri" w:hAnsi="Calibri"/>
+        </w:rPr>
+        <w:t xml:space="preserve">Change &amp; incident management — controlled prompt/tool changes; severity-based incident handling</w:t>
+      </w:r>
+    </w:p>
+    <w:p>
+      <w:pPr>
+        <w:numPr>
+          <w:ilvl w:val="0"/>
+          <w:numId w:val="1"/>
+        </w:numPr>
+        <w:spacing w:after="60"/>
+      </w:pPr>
+      <w:r>
+        <w:rPr>
+          <w:color w:val="16203A"/>
+          <w:sz w:val="22"/>
+          <w:rFonts w:ascii="Calibri" w:hAnsi="Calibri"/>
+        </w:rPr>
+        <w:t xml:space="preserve">Quarterly value review — realized savings vs the ROI model; tuning backlog</w:t>
+      </w:r>
+    </w:p>
+    <w:p>
+      <w:pPr>
+        <w:spacing w:after="120"/>
+      </w:pPr>
+      <w:r>
+        <w:rPr>
+          <w:b/>
+          <w:color w:val="0632A0"/>
+          <w:sz w:val="30"/>
+          <w:rFonts w:ascii="Calibri" w:hAnsi="Calibri"/>
+        </w:rPr>
+        <w:t xml:space="preserve">8. Implementation timeline</w:t>
+      </w:r>
+    </w:p>
+    <w:p>
+      <w:pPr>
+        <w:spacing w:after="120"/>
+      </w:pPr>
+      <w:r>
+        <w:rPr>
+          <w:color w:val="16203A"/>
+          <w:sz w:val="22"/>
+          <w:rFonts w:ascii="Calibri" w:hAnsi="Calibri"/>
+        </w:rPr>
+        <w:t xml:space="preserve">Target duration: 8 weeks.</w:t>
+      </w:r>
+    </w:p>
+    <w:tbl>
+      <w:tblPr>
+        <w:tblStyle w:val="TableGrid"/>
+        <w:tblW w:w="9360" w:type="dxa"/>
+        <w:tblBorders>
+          <w:top w:val="single" w:sz="4" w:color="DCE4F4"/>
+          <w:left w:val="single" w:sz="4" w:color="DCE4F4"/>
+          <w:bottom w:val="single" w:sz="4" w:color="DCE4F4"/>
+          <w:right w:val="single" w:sz="4" w:color="DCE4F4"/>
+          <w:insideH w:val="single" w:sz="4" w:color="DCE4F4"/>
+          <w:insideV w:val="single" w:sz="4" w:color="DCE4F4"/>
+        </w:tblBorders>
+      </w:tblPr>
+      <w:tblGrid>
+        <w:gridCol w:w="2200"/>
+        <w:gridCol w:w="1300"/>
+        <w:gridCol w:w="5860"/>
+      </w:tblGrid>
+      <w:tr>
+        <w:tc>
+          <w:tcPr>
+            <w:tcW w:w="2200" w:type="dxa"/>
+            <w:shd w:val="clear" w:fill="0632A0"/>
+          </w:tcPr>
+          <w:p>
+            <w:pPr>
+              <w:spacing w:after="20"/>
+            </w:pPr>
+            <w:r>
+              <w:rPr>
+                <w:b/>
+                <w:color w:val="FFFFFF"/>
+                <w:sz w:val="20"/>
+                <w:rFonts w:ascii="Calibri" w:hAnsi="Calibri"/>
+              </w:rPr>
+              <w:t xml:space="preserve">Phase</w:t>
+            </w:r>
+          </w:p>
+        </w:tc>
+        <w:tc>
+          <w:tcPr>
+            <w:tcW w:w="1300" w:type="dxa"/>
+            <w:shd w:val="clear" w:fill="0632A0"/>
+          </w:tcPr>
+          <w:p>
+            <w:pPr>
+              <w:spacing w:after="20"/>
+            </w:pPr>
+            <w:r>
+              <w:rPr>
+                <w:b/>
+                <w:color w:val="FFFFFF"/>
+                <w:sz w:val="20"/>
+                <w:rFonts w:ascii="Calibri" w:hAnsi="Calibri"/>
+              </w:rPr>
+              <w:t xml:space="preserve">Weeks</w:t>
+            </w:r>
+          </w:p>
+        </w:tc>
+        <w:tc>
+          <w:tcPr>
+            <w:tcW w:w="5860" w:type="dxa"/>
+            <w:shd w:val="clear" w:fill="0632A0"/>
+          </w:tcPr>
+          <w:p>
+            <w:pPr>
+              <w:spacing w:after="20"/>
+            </w:pPr>
+            <w:r>
+              <w:rPr>
+                <w:b/>
+                <w:color w:val="FFFFFF"/>
+                <w:sz w:val="20"/>
+                <w:rFonts w:ascii="Calibri" w:hAnsi="Calibri"/>
+              </w:rPr>
+              <w:t xml:space="preserve">Outcomes</w:t>
+            </w:r>
+          </w:p>
+        </w:tc>
+      </w:tr>
+      <w:tr>
+        <w:tc>
+          <w:tcPr>
+            <w:tcW w:w="2200" w:type="dxa"/>
+            <w:shd w:val="clear" w:fill="F4F7FC"/>
+          </w:tcPr>
+          <w:p>
+            <w:pPr>
+              <w:spacing w:after="20"/>
+            </w:pPr>
+            <w:r>
+              <w:rPr>
+                <w:color w:val="16203A"/>
+                <w:sz w:val="20"/>
+                <w:rFonts w:ascii="Calibri" w:hAnsi="Calibri"/>
+              </w:rPr>
+              <w:t xml:space="preserve">Discovery</w:t>
+            </w:r>
+          </w:p>
+        </w:tc>
+        <w:tc>
+          <w:tcPr>
+            <w:tcW w:w="1300" w:type="dxa"/>
+            <w:shd w:val="clear" w:fill="F4F7FC"/>
+          </w:tcPr>
+          <w:p>
+            <w:pPr>
+              <w:spacing w:after="20"/>
+            </w:pPr>
+            <w:r>
+              <w:rPr>
+                <w:color w:val="16203A"/>
+                <w:sz w:val="20"/>
+                <w:rFonts w:ascii="Calibri" w:hAnsi="Calibri"/>
+              </w:rPr>
+              <w:t xml:space="preserve">1–2</w:t>
+            </w:r>
+          </w:p>
+        </w:tc>
+        <w:tc>
+          <w:tcPr>
+            <w:tcW w:w="5860" w:type="dxa"/>
+            <w:shd w:val="clear" w:fill="F4F7FC"/>
+          </w:tcPr>
+          <w:p>
+            <w:pPr>
+              <w:spacing w:after="20"/>
+            </w:pPr>
+            <w:r>
+              <w:rPr>
+                <w:color w:val="16203A"/>
+                <w:sz w:val="20"/>
+                <w:rFonts w:ascii="Calibri" w:hAnsi="Calibri"/>
+              </w:rPr>
+              <w:t xml:space="preserve">Confirm volumes, invoice mix, target OU; finalize spec.yaml; access + Database Tools Connection</w:t>
+            </w:r>
+          </w:p>
+        </w:tc>
+      </w:tr>
+      <w:tr>
+        <w:tc>
+          <w:tcPr>
+            <w:tcW w:w="2200" w:type="dxa"/>
+            <w:shd w:val="clear" w:fill="F4F7FC"/>
+          </w:tcPr>
+          <w:p>
+            <w:pPr>
+              <w:spacing w:after="20"/>
+            </w:pPr>
+            <w:r>
+              <w:rPr>
+                <w:color w:val="16203A"/>
+                <w:sz w:val="20"/>
+                <w:rFonts w:ascii="Calibri" w:hAnsi="Calibri"/>
+              </w:rPr>
+              <w:t xml:space="preserve">Build</w:t>
+            </w:r>
+          </w:p>
+        </w:tc>
+        <w:tc>
+          <w:tcPr>
+            <w:tcW w:w="1300" w:type="dxa"/>
+            <w:shd w:val="clear" w:fill="F4F7FC"/>
+          </w:tcPr>
+          <w:p>
+            <w:pPr>
+              <w:spacing w:after="20"/>
+            </w:pPr>
+            <w:r>
+              <w:rPr>
+                <w:color w:val="16203A"/>
+                <w:sz w:val="20"/>
+                <w:rFonts w:ascii="Calibri" w:hAnsi="Calibri"/>
+              </w:rPr>
+              <w:t xml:space="preserve">3–5</w:t>
+            </w:r>
+          </w:p>
+        </w:tc>
+        <w:tc>
+          <w:tcPr>
+            <w:tcW w:w="5860" w:type="dxa"/>
+            <w:shd w:val="clear" w:fill="F4F7FC"/>
+          </w:tcPr>
+          <w:p>
+            <w:pPr>
+              <w:spacing w:after="20"/>
+            </w:pPr>
+            <w:r>
+              <w:rPr>
+                <w:color w:val="16203A"/>
+                <w:sz w:val="20"/>
+                <w:rFonts w:ascii="Calibri" w:hAnsi="Calibri"/>
+              </w:rPr>
+              <w:t xml:space="preserve">XXPAF PL/SQL + managed-MCP tools; agent flowGraph; deliverables generated</w:t>
+            </w:r>
+          </w:p>
+        </w:tc>
+      </w:tr>
+      <w:tr>
+        <w:tc>
+          <w:tcPr>
+            <w:tcW w:w="2200" w:type="dxa"/>
+            <w:shd w:val="clear" w:fill="F4F7FC"/>
+          </w:tcPr>
+          <w:p>
+            <w:pPr>
+              <w:spacing w:after="20"/>
+            </w:pPr>
+            <w:r>
+              <w:rPr>
+                <w:color w:val="16203A"/>
+                <w:sz w:val="20"/>
+                <w:rFonts w:ascii="Calibri" w:hAnsi="Calibri"/>
+              </w:rPr>
+              <w:t xml:space="preserve">Validate</w:t>
+            </w:r>
+          </w:p>
+        </w:tc>
+        <w:tc>
+          <w:tcPr>
+            <w:tcW w:w="1300" w:type="dxa"/>
+            <w:shd w:val="clear" w:fill="F4F7FC"/>
+          </w:tcPr>
+          <w:p>
+            <w:pPr>
+              <w:spacing w:after="20"/>
+            </w:pPr>
+            <w:r>
+              <w:rPr>
+                <w:color w:val="16203A"/>
+                <w:sz w:val="20"/>
+                <w:rFonts w:ascii="Calibri" w:hAnsi="Calibri"/>
+              </w:rPr>
+              <w:t xml:space="preserve">6</w:t>
+            </w:r>
+          </w:p>
+        </w:tc>
+        <w:tc>
+          <w:tcPr>
+            <w:tcW w:w="5860" w:type="dxa"/>
+            <w:shd w:val="clear" w:fill="F4F7FC"/>
+          </w:tcPr>
+          <w:p>
+            <w:pPr>
+              <w:spacing w:after="20"/>
+            </w:pPr>
+            <w:r>
+              <w:rPr>
+                <w:color w:val="16203A"/>
+                <w:sz w:val="20"/>
+                <w:rFonts w:ascii="Calibri" w:hAnsi="Calibri"/>
+              </w:rPr>
+              <w:t xml:space="preserve">Validation gate on ground-truth set; Python↔PL/SQL parity; zero unsafe actions</w:t>
+            </w:r>
+          </w:p>
+        </w:tc>
+      </w:tr>
+      <w:tr>
+        <w:tc>
+          <w:tcPr>
+            <w:tcW w:w="2200" w:type="dxa"/>
+            <w:shd w:val="clear" w:fill="F4F7FC"/>
+          </w:tcPr>
+          <w:p>
+            <w:pPr>
+              <w:spacing w:after="20"/>
+            </w:pPr>
+            <w:r>
+              <w:rPr>
+                <w:color w:val="16203A"/>
+                <w:sz w:val="20"/>
+                <w:rFonts w:ascii="Calibri" w:hAnsi="Calibri"/>
+              </w:rPr>
+              <w:t xml:space="preserve">Go-live</w:t>
+            </w:r>
+          </w:p>
+        </w:tc>
+        <w:tc>
+          <w:tcPr>
+            <w:tcW w:w="1300" w:type="dxa"/>
+            <w:shd w:val="clear" w:fill="F4F7FC"/>
+          </w:tcPr>
+          <w:p>
+            <w:pPr>
+              <w:spacing w:after="20"/>
+            </w:pPr>
+            <w:r>
+              <w:rPr>
+                <w:color w:val="16203A"/>
+                <w:sz w:val="20"/>
+                <w:rFonts w:ascii="Calibri" w:hAnsi="Calibri"/>
+              </w:rPr>
+              <w:t xml:space="preserve">7</w:t>
+            </w:r>
+          </w:p>
+        </w:tc>
+        <w:tc>
+          <w:tcPr>
+            <w:tcW w:w="5860" w:type="dxa"/>
+            <w:shd w:val="clear" w:fill="F4F7FC"/>
+          </w:tcPr>
+          <w:p>
+            <w:pPr>
+              <w:spacing w:after="20"/>
+            </w:pPr>
+            <w:r>
+              <w:rPr>
+                <w:color w:val="16203A"/>
+                <w:sz w:val="20"/>
+                <w:rFonts w:ascii="Calibri" w:hAnsi="Calibri"/>
+              </w:rPr>
+              <w:t xml:space="preserve">Import .paf, rebind MCP + LLM, UAT, scheduled Open Interface Import</w:t>
+            </w:r>
+          </w:p>
+        </w:tc>
+      </w:tr>
+      <w:tr>
+        <w:tc>
+          <w:tcPr>
+            <w:tcW w:w="2200" w:type="dxa"/>
+            <w:shd w:val="clear" w:fill="F4F7FC"/>
+          </w:tcPr>
+          <w:p>
+            <w:pPr>
+              <w:spacing w:after="20"/>
+            </w:pPr>
+            <w:r>
+              <w:rPr>
+                <w:color w:val="16203A"/>
+                <w:sz w:val="20"/>
+                <w:rFonts w:ascii="Calibri" w:hAnsi="Calibri"/>
+              </w:rPr>
+              <w:t xml:space="preserve">Hypercare</w:t>
+            </w:r>
+          </w:p>
+        </w:tc>
+        <w:tc>
+          <w:tcPr>
+            <w:tcW w:w="1300" w:type="dxa"/>
+            <w:shd w:val="clear" w:fill="F4F7FC"/>
+          </w:tcPr>
+          <w:p>
+            <w:pPr>
+              <w:spacing w:after="20"/>
+            </w:pPr>
+            <w:r>
+              <w:rPr>
+                <w:color w:val="16203A"/>
+                <w:sz w:val="20"/>
+                <w:rFonts w:ascii="Calibri" w:hAnsi="Calibri"/>
+              </w:rPr>
+              <w:t xml:space="preserve">8</w:t>
+            </w:r>
+          </w:p>
+        </w:tc>
+        <w:tc>
+          <w:tcPr>
+            <w:tcW w:w="5860" w:type="dxa"/>
+            <w:shd w:val="clear" w:fill="F4F7FC"/>
+          </w:tcPr>
+          <w:p>
+            <w:pPr>
+              <w:spacing w:after="20"/>
+            </w:pPr>
+            <w:r>
+              <w:rPr>
+                <w:color w:val="16203A"/>
+                <w:sz w:val="20"/>
+                <w:rFonts w:ascii="Calibri" w:hAnsi="Calibri"/>
+              </w:rPr>
+              <w:t xml:space="preserve">Monitored run, exception triage, KT; transition to managed services</w:t>
+            </w:r>
+          </w:p>
+        </w:tc>
+      </w:tr>
+    </w:tbl>
+    <w:p>
+      <w:pPr>
+        <w:spacing w:after="120"/>
+      </w:pPr>
+    </w:p>
+    <w:p>
+      <w:pPr>
+        <w:spacing w:after="120"/>
+      </w:pPr>
+      <w:r>
+        <w:rPr>
+          <w:b/>
+          <w:color w:val="0632A0"/>
+          <w:sz w:val="30"/>
+          <w:rFonts w:ascii="Calibri" w:hAnsi="Calibri"/>
+        </w:rPr>
+        <w:t xml:space="preserve">9. RACI matrix</w:t>
       </w:r>
     </w:p>
     <w:tbl>
@@ -301,6 +1124,65 @@
                 <w:sz w:val="20"/>
                 <w:rFonts w:ascii="Calibri" w:hAnsi="Calibri"/>
               </w:rPr>
+              <w:t xml:space="preserve">Discovery &amp; spec sign-off</w:t>
+            </w:r>
+          </w:p>
+        </w:tc>
+        <w:tc>
+          <w:tcPr>
+            <w:tcW w:w="2000" w:type="dxa"/>
+            <w:shd w:val="clear" w:fill="F4F7FC"/>
+          </w:tcPr>
+          <w:p>
+            <w:pPr>
+              <w:spacing w:after="20"/>
+            </w:pPr>
+            <w:r>
+              <w:rPr>
+                <w:color w:val="16203A"/>
+                <w:sz w:val="20"/>
+                <w:rFonts w:ascii="Calibri" w:hAnsi="Calibri"/>
+              </w:rPr>
+              <w:t xml:space="preserve">R/A</w:t>
+            </w:r>
+          </w:p>
+        </w:tc>
+        <w:tc>
+          <w:tcPr>
+            <w:tcW w:w="2000" w:type="dxa"/>
+            <w:shd w:val="clear" w:fill="F4F7FC"/>
+          </w:tcPr>
+          <w:p>
+            <w:pPr>
+              <w:spacing w:after="20"/>
+            </w:pPr>
+            <w:r>
+              <w:rPr>
+                <w:color w:val="16203A"/>
+                <w:sz w:val="20"/>
+                <w:rFonts w:ascii="Calibri" w:hAnsi="Calibri"/>
+              </w:rPr>
+              <w:t xml:space="preserve">C</w:t>
+            </w:r>
+          </w:p>
+        </w:tc>
+      </w:tr>
+      <w:tr>
+        <w:tc>
+          <w:tcPr>
+            <w:tcW w:w="5360" w:type="dxa"/>
+            <w:shd w:val="clear" w:fill="F4F7FC"/>
+          </w:tcPr>
+          <w:p>
+            <w:pPr>
+              <w:spacing w:after="20"/>
+            </w:pPr>
+            <w:r>
+              <w:rPr>
+                <w:color w:val="16203A"/>
+                <w:sz w:val="20"/>
+                <w:rFonts w:ascii="Calibri" w:hAnsi="Calibri"/>
+              </w:rPr>
               <w:t xml:space="preserve">EBS access / Database Tools Connection</w:t>
             </w:r>
           </w:p>
@@ -339,10 +1221,69 @@
                 <w:sz w:val="20"/>
                 <w:rFonts w:ascii="Calibri" w:hAnsi="Calibri"/>
               </w:rPr>
+              <w:t xml:space="preserve">R/A</w:t>
+            </w:r>
+          </w:p>
+        </w:tc>
+      </w:tr>
+      <w:tr>
+        <w:tc>
+          <w:tcPr>
+            <w:tcW w:w="5360" w:type="dxa"/>
+            <w:shd w:val="clear" w:fill="F4F7FC"/>
+          </w:tcPr>
+          <w:p>
+            <w:pPr>
+              <w:spacing w:after="20"/>
+            </w:pPr>
+            <w:r>
+              <w:rPr>
+                <w:color w:val="16203A"/>
+                <w:sz w:val="20"/>
+                <w:rFonts w:ascii="Calibri" w:hAnsi="Calibri"/>
+              </w:rPr>
+              <w:t xml:space="preserve">XXPAF PL/SQL build + deploy</w:t>
+            </w:r>
+          </w:p>
+        </w:tc>
+        <w:tc>
+          <w:tcPr>
+            <w:tcW w:w="2000" w:type="dxa"/>
+            <w:shd w:val="clear" w:fill="F4F7FC"/>
+          </w:tcPr>
+          <w:p>
+            <w:pPr>
+              <w:spacing w:after="20"/>
+            </w:pPr>
+            <w:r>
+              <w:rPr>
+                <w:color w:val="16203A"/>
+                <w:sz w:val="20"/>
+                <w:rFonts w:ascii="Calibri" w:hAnsi="Calibri"/>
+              </w:rPr>
               <w:t xml:space="preserve">R</w:t>
             </w:r>
           </w:p>
         </w:tc>
+        <w:tc>
+          <w:tcPr>
+            <w:tcW w:w="2000" w:type="dxa"/>
+            <w:shd w:val="clear" w:fill="F4F7FC"/>
+          </w:tcPr>
+          <w:p>
+            <w:pPr>
+              <w:spacing w:after="20"/>
+            </w:pPr>
+            <w:r>
+              <w:rPr>
+                <w:color w:val="16203A"/>
+                <w:sz w:val="20"/>
+                <w:rFonts w:ascii="Calibri" w:hAnsi="Calibri"/>
+              </w:rPr>
+              <w:t xml:space="preserve">A</w:t>
+            </w:r>
+          </w:p>
+        </w:tc>
       </w:tr>
       <w:tr>
         <w:tc>
@@ -360,7 +1301,7 @@
                 <w:sz w:val="20"/>
                 <w:rFonts w:ascii="Calibri" w:hAnsi="Calibri"/>
               </w:rPr>
-              <w:t xml:space="preserve">XXPAF deployment</w:t>
+              <w:t xml:space="preserve">Managed-MCP tool registration</w:t>
             </w:r>
           </w:p>
         </w:tc>
@@ -398,6 +1339,242 @@
                 <w:sz w:val="20"/>
                 <w:rFonts w:ascii="Calibri" w:hAnsi="Calibri"/>
               </w:rPr>
+              <w:t xml:space="preserve">C</w:t>
+            </w:r>
+          </w:p>
+        </w:tc>
+      </w:tr>
+      <w:tr>
+        <w:tc>
+          <w:tcPr>
+            <w:tcW w:w="5360" w:type="dxa"/>
+            <w:shd w:val="clear" w:fill="F4F7FC"/>
+          </w:tcPr>
+          <w:p>
+            <w:pPr>
+              <w:spacing w:after="20"/>
+            </w:pPr>
+            <w:r>
+              <w:rPr>
+                <w:color w:val="16203A"/>
+                <w:sz w:val="20"/>
+                <w:rFonts w:ascii="Calibri" w:hAnsi="Calibri"/>
+              </w:rPr>
+              <w:t xml:space="preserve">Agent build + .paf import</w:t>
+            </w:r>
+          </w:p>
+        </w:tc>
+        <w:tc>
+          <w:tcPr>
+            <w:tcW w:w="2000" w:type="dxa"/>
+            <w:shd w:val="clear" w:fill="F4F7FC"/>
+          </w:tcPr>
+          <w:p>
+            <w:pPr>
+              <w:spacing w:after="20"/>
+            </w:pPr>
+            <w:r>
+              <w:rPr>
+                <w:color w:val="16203A"/>
+                <w:sz w:val="20"/>
+                <w:rFonts w:ascii="Calibri" w:hAnsi="Calibri"/>
+              </w:rPr>
+              <w:t xml:space="preserve">R</w:t>
+            </w:r>
+          </w:p>
+        </w:tc>
+        <w:tc>
+          <w:tcPr>
+            <w:tcW w:w="2000" w:type="dxa"/>
+            <w:shd w:val="clear" w:fill="F4F7FC"/>
+          </w:tcPr>
+          <w:p>
+            <w:pPr>
+              <w:spacing w:after="20"/>
+            </w:pPr>
+            <w:r>
+              <w:rPr>
+                <w:color w:val="16203A"/>
+                <w:sz w:val="20"/>
+                <w:rFonts w:ascii="Calibri" w:hAnsi="Calibri"/>
+              </w:rPr>
+              <w:t xml:space="preserve">C</w:t>
+            </w:r>
+          </w:p>
+        </w:tc>
+      </w:tr>
+      <w:tr>
+        <w:tc>
+          <w:tcPr>
+            <w:tcW w:w="5360" w:type="dxa"/>
+            <w:shd w:val="clear" w:fill="F4F7FC"/>
+          </w:tcPr>
+          <w:p>
+            <w:pPr>
+              <w:spacing w:after="20"/>
+            </w:pPr>
+            <w:r>
+              <w:rPr>
+                <w:color w:val="16203A"/>
+                <w:sz w:val="20"/>
+                <w:rFonts w:ascii="Calibri" w:hAnsi="Calibri"/>
+              </w:rPr>
+              <w:t xml:space="preserve">Validation-gate execution</w:t>
+            </w:r>
+          </w:p>
+        </w:tc>
+        <w:tc>
+          <w:tcPr>
+            <w:tcW w:w="2000" w:type="dxa"/>
+            <w:shd w:val="clear" w:fill="F4F7FC"/>
+          </w:tcPr>
+          <w:p>
+            <w:pPr>
+              <w:spacing w:after="20"/>
+            </w:pPr>
+            <w:r>
+              <w:rPr>
+                <w:color w:val="16203A"/>
+                <w:sz w:val="20"/>
+                <w:rFonts w:ascii="Calibri" w:hAnsi="Calibri"/>
+              </w:rPr>
+              <w:t xml:space="preserve">R</w:t>
+            </w:r>
+          </w:p>
+        </w:tc>
+        <w:tc>
+          <w:tcPr>
+            <w:tcW w:w="2000" w:type="dxa"/>
+            <w:shd w:val="clear" w:fill="F4F7FC"/>
+          </w:tcPr>
+          <w:p>
+            <w:pPr>
+              <w:spacing w:after="20"/>
+            </w:pPr>
+            <w:r>
+              <w:rPr>
+                <w:color w:val="16203A"/>
+                <w:sz w:val="20"/>
+                <w:rFonts w:ascii="Calibri" w:hAnsi="Calibri"/>
+              </w:rPr>
+              <w:t xml:space="preserve">C</w:t>
+            </w:r>
+          </w:p>
+        </w:tc>
+      </w:tr>
+      <w:tr>
+        <w:tc>
+          <w:tcPr>
+            <w:tcW w:w="5360" w:type="dxa"/>
+            <w:shd w:val="clear" w:fill="F4F7FC"/>
+          </w:tcPr>
+          <w:p>
+            <w:pPr>
+              <w:spacing w:after="20"/>
+            </w:pPr>
+            <w:r>
+              <w:rPr>
+                <w:color w:val="16203A"/>
+                <w:sz w:val="20"/>
+                <w:rFonts w:ascii="Calibri" w:hAnsi="Calibri"/>
+              </w:rPr>
+              <w:t xml:space="preserve">UAT &amp; acceptance</w:t>
+            </w:r>
+          </w:p>
+        </w:tc>
+        <w:tc>
+          <w:tcPr>
+            <w:tcW w:w="2000" w:type="dxa"/>
+            <w:shd w:val="clear" w:fill="F4F7FC"/>
+          </w:tcPr>
+          <w:p>
+            <w:pPr>
+              <w:spacing w:after="20"/>
+            </w:pPr>
+            <w:r>
+              <w:rPr>
+                <w:color w:val="16203A"/>
+                <w:sz w:val="20"/>
+                <w:rFonts w:ascii="Calibri" w:hAnsi="Calibri"/>
+              </w:rPr>
+              <w:t xml:space="preserve">C</w:t>
+            </w:r>
+          </w:p>
+        </w:tc>
+        <w:tc>
+          <w:tcPr>
+            <w:tcW w:w="2000" w:type="dxa"/>
+            <w:shd w:val="clear" w:fill="F4F7FC"/>
+          </w:tcPr>
+          <w:p>
+            <w:pPr>
+              <w:spacing w:after="20"/>
+            </w:pPr>
+            <w:r>
+              <w:rPr>
+                <w:color w:val="16203A"/>
+                <w:sz w:val="20"/>
+                <w:rFonts w:ascii="Calibri" w:hAnsi="Calibri"/>
+              </w:rPr>
+              <w:t xml:space="preserve">R/A</w:t>
+            </w:r>
+          </w:p>
+        </w:tc>
+      </w:tr>
+      <w:tr>
+        <w:tc>
+          <w:tcPr>
+            <w:tcW w:w="5360" w:type="dxa"/>
+            <w:shd w:val="clear" w:fill="F4F7FC"/>
+          </w:tcPr>
+          <w:p>
+            <w:pPr>
+              <w:spacing w:after="20"/>
+            </w:pPr>
+            <w:r>
+              <w:rPr>
+                <w:color w:val="16203A"/>
+                <w:sz w:val="20"/>
+                <w:rFonts w:ascii="Calibri" w:hAnsi="Calibri"/>
+              </w:rPr>
+              <w:t xml:space="preserve">Go-live &amp; scheduling</w:t>
+            </w:r>
+          </w:p>
+        </w:tc>
+        <w:tc>
+          <w:tcPr>
+            <w:tcW w:w="2000" w:type="dxa"/>
+            <w:shd w:val="clear" w:fill="F4F7FC"/>
+          </w:tcPr>
+          <w:p>
+            <w:pPr>
+              <w:spacing w:after="20"/>
+            </w:pPr>
+            <w:r>
+              <w:rPr>
+                <w:color w:val="16203A"/>
+                <w:sz w:val="20"/>
+                <w:rFonts w:ascii="Calibri" w:hAnsi="Calibri"/>
+              </w:rPr>
+              <w:t xml:space="preserve">R</w:t>
+            </w:r>
+          </w:p>
+        </w:tc>
+        <w:tc>
+          <w:tcPr>
+            <w:tcW w:w="2000" w:type="dxa"/>
+            <w:shd w:val="clear" w:fill="F4F7FC"/>
+          </w:tcPr>
+          <w:p>
+            <w:pPr>
+              <w:spacing w:after="20"/>
+            </w:pPr>
+            <w:r>
+              <w:rPr>
+                <w:color w:val="16203A"/>
+                <w:sz w:val="20"/>
+                <w:rFonts w:ascii="Calibri" w:hAnsi="Calibri"/>
+              </w:rPr>
               <w:t xml:space="preserve">A</w:t>
             </w:r>
           </w:p>
@@ -419,7 +1596,7 @@
                 <w:sz w:val="20"/>
                 <w:rFonts w:ascii="Calibri" w:hAnsi="Calibri"/>
               </w:rPr>
-              <w:t xml:space="preserve">PAF agent build + import</w:t>
+              <w:t xml:space="preserve">Ongoing managed services</w:t>
             </w:r>
           </w:p>
         </w:tc>
@@ -478,7 +1655,7 @@
                 <w:sz w:val="20"/>
                 <w:rFonts w:ascii="Calibri" w:hAnsi="Calibri"/>
               </w:rPr>
-              <w:t xml:space="preserve">UAT &amp; acceptance</w:t>
+              <w:t xml:space="preserve">Security / change approvals</w:t>
             </w:r>
           </w:p>
         </w:tc>
@@ -516,7 +1693,7 @@
                 <w:sz w:val="20"/>
                 <w:rFonts w:ascii="Calibri" w:hAnsi="Calibri"/>
               </w:rPr>
-              <w:t xml:space="preserve">R</w:t>
+              <w:t xml:space="preserve">R/A</w:t>
             </w:r>
           </w:p>
         </w:tc>
@@ -538,7 +1715,685 @@
           <w:sz w:val="30"/>
           <w:rFonts w:ascii="Calibri" w:hAnsi="Calibri"/>
         </w:rPr>
-        <w:t xml:space="preserve">5. Pricing</w:t>
+        <w:t xml:space="preserve">10. Service levels (SLAs)</w:t>
+      </w:r>
+    </w:p>
+    <w:tbl>
+      <w:tblPr>
+        <w:tblStyle w:val="TableGrid"/>
+        <w:tblW w:w="9360" w:type="dxa"/>
+        <w:tblBorders>
+          <w:top w:val="single" w:sz="4" w:color="DCE4F4"/>
+          <w:left w:val="single" w:sz="4" w:color="DCE4F4"/>
+          <w:bottom w:val="single" w:sz="4" w:color="DCE4F4"/>
+          <w:right w:val="single" w:sz="4" w:color="DCE4F4"/>
+          <w:insideH w:val="single" w:sz="4" w:color="DCE4F4"/>
+          <w:insideV w:val="single" w:sz="4" w:color="DCE4F4"/>
+        </w:tblBorders>
+      </w:tblPr>
+      <w:tblGrid>
+        <w:gridCol w:w="5360"/>
+        <w:gridCol w:w="4000"/>
+      </w:tblGrid>
+      <w:tr>
+        <w:tc>
+          <w:tcPr>
+            <w:tcW w:w="5360" w:type="dxa"/>
+            <w:shd w:val="clear" w:fill="0632A0"/>
+          </w:tcPr>
+          <w:p>
+            <w:pPr>
+              <w:spacing w:after="20"/>
+            </w:pPr>
+            <w:r>
+              <w:rPr>
+                <w:b/>
+                <w:color w:val="FFFFFF"/>
+                <w:sz w:val="20"/>
+                <w:rFonts w:ascii="Calibri" w:hAnsi="Calibri"/>
+              </w:rPr>
+              <w:t xml:space="preserve">Metric</w:t>
+            </w:r>
+          </w:p>
+        </w:tc>
+        <w:tc>
+          <w:tcPr>
+            <w:tcW w:w="4000" w:type="dxa"/>
+            <w:shd w:val="clear" w:fill="0632A0"/>
+          </w:tcPr>
+          <w:p>
+            <w:pPr>
+              <w:spacing w:after="20"/>
+            </w:pPr>
+            <w:r>
+              <w:rPr>
+                <w:b/>
+                <w:color w:val="FFFFFF"/>
+                <w:sz w:val="20"/>
+                <w:rFonts w:ascii="Calibri" w:hAnsi="Calibri"/>
+              </w:rPr>
+              <w:t xml:space="preserve">Target</w:t>
+            </w:r>
+          </w:p>
+        </w:tc>
+      </w:tr>
+      <w:tr>
+        <w:tc>
+          <w:tcPr>
+            <w:tcW w:w="5360" w:type="dxa"/>
+            <w:shd w:val="clear" w:fill="F4F7FC"/>
+          </w:tcPr>
+          <w:p>
+            <w:pPr>
+              <w:spacing w:after="20"/>
+            </w:pPr>
+            <w:r>
+              <w:rPr>
+                <w:color w:val="16203A"/>
+                <w:sz w:val="20"/>
+                <w:rFonts w:ascii="Calibri" w:hAnsi="Calibri"/>
+              </w:rPr>
+              <w:t xml:space="preserve">Agent service availability</w:t>
+            </w:r>
+          </w:p>
+        </w:tc>
+        <w:tc>
+          <w:tcPr>
+            <w:tcW w:w="4000" w:type="dxa"/>
+            <w:shd w:val="clear" w:fill="F4F7FC"/>
+          </w:tcPr>
+          <w:p>
+            <w:pPr>
+              <w:spacing w:after="20"/>
+            </w:pPr>
+            <w:r>
+              <w:rPr>
+                <w:color w:val="16203A"/>
+                <w:sz w:val="20"/>
+                <w:rFonts w:ascii="Calibri" w:hAnsi="Calibri"/>
+              </w:rPr>
+              <w:t xml:space="preserve">99.5% monthly (excl. EBS/OCI maintenance)</w:t>
+            </w:r>
+          </w:p>
+        </w:tc>
+      </w:tr>
+      <w:tr>
+        <w:tc>
+          <w:tcPr>
+            <w:tcW w:w="5360" w:type="dxa"/>
+            <w:shd w:val="clear" w:fill="F4F7FC"/>
+          </w:tcPr>
+          <w:p>
+            <w:pPr>
+              <w:spacing w:after="20"/>
+            </w:pPr>
+            <w:r>
+              <w:rPr>
+                <w:color w:val="16203A"/>
+                <w:sz w:val="20"/>
+                <w:rFonts w:ascii="Calibri" w:hAnsi="Calibri"/>
+              </w:rPr>
+              <w:t xml:space="preserve">P1 (service down) response / resolution</w:t>
+            </w:r>
+          </w:p>
+        </w:tc>
+        <w:tc>
+          <w:tcPr>
+            <w:tcW w:w="4000" w:type="dxa"/>
+            <w:shd w:val="clear" w:fill="F4F7FC"/>
+          </w:tcPr>
+          <w:p>
+            <w:pPr>
+              <w:spacing w:after="20"/>
+            </w:pPr>
+            <w:r>
+              <w:rPr>
+                <w:color w:val="16203A"/>
+                <w:sz w:val="20"/>
+                <w:rFonts w:ascii="Calibri" w:hAnsi="Calibri"/>
+              </w:rPr>
+              <w:t xml:space="preserve">1 hr / 8 business hrs</w:t>
+            </w:r>
+          </w:p>
+        </w:tc>
+      </w:tr>
+      <w:tr>
+        <w:tc>
+          <w:tcPr>
+            <w:tcW w:w="5360" w:type="dxa"/>
+            <w:shd w:val="clear" w:fill="F4F7FC"/>
+          </w:tcPr>
+          <w:p>
+            <w:pPr>
+              <w:spacing w:after="20"/>
+            </w:pPr>
+            <w:r>
+              <w:rPr>
+                <w:color w:val="16203A"/>
+                <w:sz w:val="20"/>
+                <w:rFonts w:ascii="Calibri" w:hAnsi="Calibri"/>
+              </w:rPr>
+              <w:t xml:space="preserve">P2 (degraded) response / resolution</w:t>
+            </w:r>
+          </w:p>
+        </w:tc>
+        <w:tc>
+          <w:tcPr>
+            <w:tcW w:w="4000" w:type="dxa"/>
+            <w:shd w:val="clear" w:fill="F4F7FC"/>
+          </w:tcPr>
+          <w:p>
+            <w:pPr>
+              <w:spacing w:after="20"/>
+            </w:pPr>
+            <w:r>
+              <w:rPr>
+                <w:color w:val="16203A"/>
+                <w:sz w:val="20"/>
+                <w:rFonts w:ascii="Calibri" w:hAnsi="Calibri"/>
+              </w:rPr>
+              <w:t xml:space="preserve">4 business hrs / 2 business days</w:t>
+            </w:r>
+          </w:p>
+        </w:tc>
+      </w:tr>
+      <w:tr>
+        <w:tc>
+          <w:tcPr>
+            <w:tcW w:w="5360" w:type="dxa"/>
+            <w:shd w:val="clear" w:fill="F4F7FC"/>
+          </w:tcPr>
+          <w:p>
+            <w:pPr>
+              <w:spacing w:after="20"/>
+            </w:pPr>
+            <w:r>
+              <w:rPr>
+                <w:color w:val="16203A"/>
+                <w:sz w:val="20"/>
+                <w:rFonts w:ascii="Calibri" w:hAnsi="Calibri"/>
+              </w:rPr>
+              <w:t xml:space="preserve">P3 (question / minor) response</w:t>
+            </w:r>
+          </w:p>
+        </w:tc>
+        <w:tc>
+          <w:tcPr>
+            <w:tcW w:w="4000" w:type="dxa"/>
+            <w:shd w:val="clear" w:fill="F4F7FC"/>
+          </w:tcPr>
+          <w:p>
+            <w:pPr>
+              <w:spacing w:after="20"/>
+            </w:pPr>
+            <w:r>
+              <w:rPr>
+                <w:color w:val="16203A"/>
+                <w:sz w:val="20"/>
+                <w:rFonts w:ascii="Calibri" w:hAnsi="Calibri"/>
+              </w:rPr>
+              <w:t xml:space="preserve">1 business day</w:t>
+            </w:r>
+          </w:p>
+        </w:tc>
+      </w:tr>
+      <w:tr>
+        <w:tc>
+          <w:tcPr>
+            <w:tcW w:w="5360" w:type="dxa"/>
+            <w:shd w:val="clear" w:fill="F4F7FC"/>
+          </w:tcPr>
+          <w:p>
+            <w:pPr>
+              <w:spacing w:after="20"/>
+            </w:pPr>
+            <w:r>
+              <w:rPr>
+                <w:color w:val="16203A"/>
+                <w:sz w:val="20"/>
+                <w:rFonts w:ascii="Calibri" w:hAnsi="Calibri"/>
+              </w:rPr>
+              <w:t xml:space="preserve">Support hours</w:t>
+            </w:r>
+          </w:p>
+        </w:tc>
+        <w:tc>
+          <w:tcPr>
+            <w:tcW w:w="4000" w:type="dxa"/>
+            <w:shd w:val="clear" w:fill="F4F7FC"/>
+          </w:tcPr>
+          <w:p>
+            <w:pPr>
+              <w:spacing w:after="20"/>
+            </w:pPr>
+            <w:r>
+              <w:rPr>
+                <w:color w:val="16203A"/>
+                <w:sz w:val="20"/>
+                <w:rFonts w:ascii="Calibri" w:hAnsi="Calibri"/>
+              </w:rPr>
+              <w:t xml:space="preserve">8×5 (24×7 optional)</w:t>
+            </w:r>
+          </w:p>
+        </w:tc>
+      </w:tr>
+      <w:tr>
+        <w:tc>
+          <w:tcPr>
+            <w:tcW w:w="5360" w:type="dxa"/>
+            <w:shd w:val="clear" w:fill="F4F7FC"/>
+          </w:tcPr>
+          <w:p>
+            <w:pPr>
+              <w:spacing w:after="20"/>
+            </w:pPr>
+            <w:r>
+              <w:rPr>
+                <w:color w:val="16203A"/>
+                <w:sz w:val="20"/>
+                <w:rFonts w:ascii="Calibri" w:hAnsi="Calibri"/>
+              </w:rPr>
+              <w:t xml:space="preserve">QA-gate pass on accepted invoices</w:t>
+            </w:r>
+          </w:p>
+        </w:tc>
+        <w:tc>
+          <w:tcPr>
+            <w:tcW w:w="4000" w:type="dxa"/>
+            <w:shd w:val="clear" w:fill="F4F7FC"/>
+          </w:tcPr>
+          <w:p>
+            <w:pPr>
+              <w:spacing w:after="20"/>
+            </w:pPr>
+            <w:r>
+              <w:rPr>
+                <w:color w:val="16203A"/>
+                <w:sz w:val="20"/>
+                <w:rFonts w:ascii="Calibri" w:hAnsi="Calibri"/>
+              </w:rPr>
+              <w:t xml:space="preserve">100% balanced + reconciled before load</w:t>
+            </w:r>
+          </w:p>
+        </w:tc>
+      </w:tr>
+      <w:tr>
+        <w:tc>
+          <w:tcPr>
+            <w:tcW w:w="5360" w:type="dxa"/>
+            <w:shd w:val="clear" w:fill="F4F7FC"/>
+          </w:tcPr>
+          <w:p>
+            <w:pPr>
+              <w:spacing w:after="20"/>
+            </w:pPr>
+            <w:r>
+              <w:rPr>
+                <w:color w:val="16203A"/>
+                <w:sz w:val="20"/>
+                <w:rFonts w:ascii="Calibri" w:hAnsi="Calibri"/>
+              </w:rPr>
+              <w:t xml:space="preserve">Extraction accuracy (sampled)</w:t>
+            </w:r>
+          </w:p>
+        </w:tc>
+        <w:tc>
+          <w:tcPr>
+            <w:tcW w:w="4000" w:type="dxa"/>
+            <w:shd w:val="clear" w:fill="F4F7FC"/>
+          </w:tcPr>
+          <w:p>
+            <w:pPr>
+              <w:spacing w:after="20"/>
+            </w:pPr>
+            <w:r>
+              <w:rPr>
+                <w:color w:val="16203A"/>
+                <w:sz w:val="20"/>
+                <w:rFonts w:ascii="Calibri" w:hAnsi="Calibri"/>
+              </w:rPr>
+              <w:t xml:space="preserve">≥ 98% on in-scope document types</w:t>
+            </w:r>
+          </w:p>
+        </w:tc>
+      </w:tr>
+    </w:tbl>
+    <w:p>
+      <w:pPr>
+        <w:spacing w:after="120"/>
+      </w:pPr>
+    </w:p>
+    <w:p>
+      <w:pPr>
+        <w:spacing w:after="120"/>
+      </w:pPr>
+      <w:r>
+        <w:rPr>
+          <w:b/>
+          <w:color w:val="0632A0"/>
+          <w:sz w:val="30"/>
+          <w:rFonts w:ascii="Calibri" w:hAnsi="Calibri"/>
+        </w:rPr>
+        <w:t xml:space="preserve">11. Entitlements</w:t>
+      </w:r>
+    </w:p>
+    <w:tbl>
+      <w:tblPr>
+        <w:tblStyle w:val="TableGrid"/>
+        <w:tblW w:w="9360" w:type="dxa"/>
+        <w:tblBorders>
+          <w:top w:val="single" w:sz="4" w:color="DCE4F4"/>
+          <w:left w:val="single" w:sz="4" w:color="DCE4F4"/>
+          <w:bottom w:val="single" w:sz="4" w:color="DCE4F4"/>
+          <w:right w:val="single" w:sz="4" w:color="DCE4F4"/>
+          <w:insideH w:val="single" w:sz="4" w:color="DCE4F4"/>
+          <w:insideV w:val="single" w:sz="4" w:color="DCE4F4"/>
+        </w:tblBorders>
+      </w:tblPr>
+      <w:tblGrid>
+        <w:gridCol w:w="3360"/>
+        <w:gridCol w:w="6000"/>
+      </w:tblGrid>
+      <w:tr>
+        <w:tc>
+          <w:tcPr>
+            <w:tcW w:w="3360" w:type="dxa"/>
+            <w:shd w:val="clear" w:fill="0632A0"/>
+          </w:tcPr>
+          <w:p>
+            <w:pPr>
+              <w:spacing w:after="20"/>
+            </w:pPr>
+            <w:r>
+              <w:rPr>
+                <w:b/>
+                <w:color w:val="FFFFFF"/>
+                <w:sz w:val="20"/>
+                <w:rFonts w:ascii="Calibri" w:hAnsi="Calibri"/>
+              </w:rPr>
+              <w:t xml:space="preserve">Item</w:t>
+            </w:r>
+          </w:p>
+        </w:tc>
+        <w:tc>
+          <w:tcPr>
+            <w:tcW w:w="6000" w:type="dxa"/>
+            <w:shd w:val="clear" w:fill="0632A0"/>
+          </w:tcPr>
+          <w:p>
+            <w:pPr>
+              <w:spacing w:after="20"/>
+            </w:pPr>
+            <w:r>
+              <w:rPr>
+                <w:b/>
+                <w:color w:val="FFFFFF"/>
+                <w:sz w:val="20"/>
+                <w:rFonts w:ascii="Calibri" w:hAnsi="Calibri"/>
+              </w:rPr>
+              <w:t xml:space="preserve">Included</w:t>
+            </w:r>
+          </w:p>
+        </w:tc>
+      </w:tr>
+      <w:tr>
+        <w:tc>
+          <w:tcPr>
+            <w:tcW w:w="3360" w:type="dxa"/>
+            <w:shd w:val="clear" w:fill="F4F7FC"/>
+          </w:tcPr>
+          <w:p>
+            <w:pPr>
+              <w:spacing w:after="20"/>
+            </w:pPr>
+            <w:r>
+              <w:rPr>
+                <w:color w:val="16203A"/>
+                <w:sz w:val="20"/>
+                <w:rFonts w:ascii="Calibri" w:hAnsi="Calibri"/>
+              </w:rPr>
+              <w:t xml:space="preserve">Agent license</w:t>
+            </w:r>
+          </w:p>
+        </w:tc>
+        <w:tc>
+          <w:tcPr>
+            <w:tcW w:w="6000" w:type="dxa"/>
+            <w:shd w:val="clear" w:fill="F4F7FC"/>
+          </w:tcPr>
+          <w:p>
+            <w:pPr>
+              <w:spacing w:after="20"/>
+            </w:pPr>
+            <w:r>
+              <w:rPr>
+                <w:color w:val="16203A"/>
+                <w:sz w:val="20"/>
+                <w:rFonts w:ascii="Calibri" w:hAnsi="Calibri"/>
+              </w:rPr>
+              <w:t xml:space="preserve">1 production agent (this domain); add-on agents priced separately</w:t>
+            </w:r>
+          </w:p>
+        </w:tc>
+      </w:tr>
+      <w:tr>
+        <w:tc>
+          <w:tcPr>
+            <w:tcW w:w="3360" w:type="dxa"/>
+            <w:shd w:val="clear" w:fill="F4F7FC"/>
+          </w:tcPr>
+          <w:p>
+            <w:pPr>
+              <w:spacing w:after="20"/>
+            </w:pPr>
+            <w:r>
+              <w:rPr>
+                <w:color w:val="16203A"/>
+                <w:sz w:val="20"/>
+                <w:rFonts w:ascii="Calibri" w:hAnsi="Calibri"/>
+              </w:rPr>
+              <w:t xml:space="preserve">Environments</w:t>
+            </w:r>
+          </w:p>
+        </w:tc>
+        <w:tc>
+          <w:tcPr>
+            <w:tcW w:w="6000" w:type="dxa"/>
+            <w:shd w:val="clear" w:fill="F4F7FC"/>
+          </w:tcPr>
+          <w:p>
+            <w:pPr>
+              <w:spacing w:after="20"/>
+            </w:pPr>
+            <w:r>
+              <w:rPr>
+                <w:color w:val="16203A"/>
+                <w:sz w:val="20"/>
+                <w:rFonts w:ascii="Calibri" w:hAnsi="Calibri"/>
+              </w:rPr>
+              <w:t xml:space="preserve">Production + one non-prod (UAT)</w:t>
+            </w:r>
+          </w:p>
+        </w:tc>
+      </w:tr>
+      <w:tr>
+        <w:tc>
+          <w:tcPr>
+            <w:tcW w:w="3360" w:type="dxa"/>
+            <w:shd w:val="clear" w:fill="F4F7FC"/>
+          </w:tcPr>
+          <w:p>
+            <w:pPr>
+              <w:spacing w:after="20"/>
+            </w:pPr>
+            <w:r>
+              <w:rPr>
+                <w:color w:val="16203A"/>
+                <w:sz w:val="20"/>
+                <w:rFonts w:ascii="Calibri" w:hAnsi="Calibri"/>
+              </w:rPr>
+              <w:t xml:space="preserve">Included run hours</w:t>
+            </w:r>
+          </w:p>
+        </w:tc>
+        <w:tc>
+          <w:tcPr>
+            <w:tcW w:w="6000" w:type="dxa"/>
+            <w:shd w:val="clear" w:fill="F4F7FC"/>
+          </w:tcPr>
+          <w:p>
+            <w:pPr>
+              <w:spacing w:after="20"/>
+            </w:pPr>
+            <w:r>
+              <w:rPr>
+                <w:color w:val="16203A"/>
+                <w:sz w:val="20"/>
+                <w:rFonts w:ascii="Calibri" w:hAnsi="Calibri"/>
+              </w:rPr>
+              <w:t xml:space="preserve">40 hrs/month managed-services run team</w:t>
+            </w:r>
+          </w:p>
+        </w:tc>
+      </w:tr>
+      <w:tr>
+        <w:tc>
+          <w:tcPr>
+            <w:tcW w:w="3360" w:type="dxa"/>
+            <w:shd w:val="clear" w:fill="F4F7FC"/>
+          </w:tcPr>
+          <w:p>
+            <w:pPr>
+              <w:spacing w:after="20"/>
+            </w:pPr>
+            <w:r>
+              <w:rPr>
+                <w:color w:val="16203A"/>
+                <w:sz w:val="20"/>
+                <w:rFonts w:ascii="Calibri" w:hAnsi="Calibri"/>
+              </w:rPr>
+              <w:t xml:space="preserve">Updates &amp; upgrades</w:t>
+            </w:r>
+          </w:p>
+        </w:tc>
+        <w:tc>
+          <w:tcPr>
+            <w:tcW w:w="6000" w:type="dxa"/>
+            <w:shd w:val="clear" w:fill="F4F7FC"/>
+          </w:tcPr>
+          <w:p>
+            <w:pPr>
+              <w:spacing w:after="20"/>
+            </w:pPr>
+            <w:r>
+              <w:rPr>
+                <w:color w:val="16203A"/>
+                <w:sz w:val="20"/>
+                <w:rFonts w:ascii="Calibri" w:hAnsi="Calibri"/>
+              </w:rPr>
+              <w:t xml:space="preserve">Prompt / model / tool updates + PAF-release compatibility</w:t>
+            </w:r>
+          </w:p>
+        </w:tc>
+      </w:tr>
+      <w:tr>
+        <w:tc>
+          <w:tcPr>
+            <w:tcW w:w="3360" w:type="dxa"/>
+            <w:shd w:val="clear" w:fill="F4F7FC"/>
+          </w:tcPr>
+          <w:p>
+            <w:pPr>
+              <w:spacing w:after="20"/>
+            </w:pPr>
+            <w:r>
+              <w:rPr>
+                <w:color w:val="16203A"/>
+                <w:sz w:val="20"/>
+                <w:rFonts w:ascii="Calibri" w:hAnsi="Calibri"/>
+              </w:rPr>
+              <w:t xml:space="preserve">Support tier</w:t>
+            </w:r>
+          </w:p>
+        </w:tc>
+        <w:tc>
+          <w:tcPr>
+            <w:tcW w:w="6000" w:type="dxa"/>
+            <w:shd w:val="clear" w:fill="F4F7FC"/>
+          </w:tcPr>
+          <w:p>
+            <w:pPr>
+              <w:spacing w:after="20"/>
+            </w:pPr>
+            <w:r>
+              <w:rPr>
+                <w:color w:val="16203A"/>
+                <w:sz w:val="20"/>
+                <w:rFonts w:ascii="Calibri" w:hAnsi="Calibri"/>
+              </w:rPr>
+              <w:t xml:space="preserve">Standard 8×5 (per SLA table); premium 24×7 optional</w:t>
+            </w:r>
+          </w:p>
+        </w:tc>
+      </w:tr>
+      <w:tr>
+        <w:tc>
+          <w:tcPr>
+            <w:tcW w:w="3360" w:type="dxa"/>
+            <w:shd w:val="clear" w:fill="F4F7FC"/>
+          </w:tcPr>
+          <w:p>
+            <w:pPr>
+              <w:spacing w:after="20"/>
+            </w:pPr>
+            <w:r>
+              <w:rPr>
+                <w:color w:val="16203A"/>
+                <w:sz w:val="20"/>
+                <w:rFonts w:ascii="Calibri" w:hAnsi="Calibri"/>
+              </w:rPr>
+              <w:t xml:space="preserve">Documentation</w:t>
+            </w:r>
+          </w:p>
+        </w:tc>
+        <w:tc>
+          <w:tcPr>
+            <w:tcW w:w="6000" w:type="dxa"/>
+            <w:shd w:val="clear" w:fill="F4F7FC"/>
+          </w:tcPr>
+          <w:p>
+            <w:pPr>
+              <w:spacing w:after="20"/>
+            </w:pPr>
+            <w:r>
+              <w:rPr>
+                <w:color w:val="16203A"/>
+                <w:sz w:val="20"/>
+                <w:rFonts w:ascii="Calibri" w:hAnsi="Calibri"/>
+              </w:rPr>
+              <w:t xml:space="preserve">Installation, technical design, validation gate, QA report</w:t>
+            </w:r>
+          </w:p>
+        </w:tc>
+      </w:tr>
+    </w:tbl>
+    <w:p>
+      <w:pPr>
+        <w:spacing w:after="120"/>
+      </w:pPr>
+    </w:p>
+    <w:p>
+      <w:pPr>
+        <w:spacing w:after="120"/>
+      </w:pPr>
+      <w:r>
+        <w:rPr>
+          <w:b/>
+          <w:color w:val="0632A0"/>
+          <w:sz w:val="30"/>
+          <w:rFonts w:ascii="Calibri" w:hAnsi="Calibri"/>
+        </w:rPr>
+        <w:t xml:space="preserve">12. Pricing</w:t>
       </w:r>
     </w:p>
     <w:p>
@@ -941,25 +2796,525 @@
       </w:pPr>
       <w:r>
         <w:rPr>
-          <w:color w:val="16203A"/>
-          <w:sz w:val="22"/>
-          <w:rFonts w:ascii="Calibri" w:hAnsi="Calibri"/>
-        </w:rPr>
-        <w:t xml:space="preserve">Estimated first-year net savings ~ $822,520; payback ~ 1.4 months. See the ROI calculator and OCI BOM for detail.</w:t>
-      </w:r>
-    </w:p>
-    <w:p>
-      <w:pPr>
-        <w:spacing w:after="120"/>
-      </w:pPr>
-      <w:r>
-        <w:rPr>
           <w:b/>
           <w:color w:val="0632A0"/>
           <w:sz w:val="30"/>
           <w:rFonts w:ascii="Calibri" w:hAnsi="Calibri"/>
         </w:rPr>
-        <w:t xml:space="preserve">6. Acceptance &amp; signatures</w:t>
+        <w:t xml:space="preserve">13. OCI Bill of Materials</w:t>
+      </w:r>
+    </w:p>
+    <w:tbl>
+      <w:tblPr>
+        <w:tblStyle w:val="TableGrid"/>
+        <w:tblW w:w="9360" w:type="dxa"/>
+        <w:tblBorders>
+          <w:top w:val="single" w:sz="4" w:color="DCE4F4"/>
+          <w:left w:val="single" w:sz="4" w:color="DCE4F4"/>
+          <w:bottom w:val="single" w:sz="4" w:color="DCE4F4"/>
+          <w:right w:val="single" w:sz="4" w:color="DCE4F4"/>
+          <w:insideH w:val="single" w:sz="4" w:color="DCE4F4"/>
+          <w:insideV w:val="single" w:sz="4" w:color="DCE4F4"/>
+        </w:tblBorders>
+      </w:tblPr>
+      <w:tblGrid>
+        <w:gridCol w:w="3800"/>
+        <w:gridCol w:w="3000"/>
+        <w:gridCol w:w="2560"/>
+      </w:tblGrid>
+      <w:tr>
+        <w:tc>
+          <w:tcPr>
+            <w:tcW w:w="3800" w:type="dxa"/>
+            <w:shd w:val="clear" w:fill="0632A0"/>
+          </w:tcPr>
+          <w:p>
+            <w:pPr>
+              <w:spacing w:after="20"/>
+            </w:pPr>
+            <w:r>
+              <w:rPr>
+                <w:b/>
+                <w:color w:val="FFFFFF"/>
+                <w:sz w:val="20"/>
+                <w:rFonts w:ascii="Calibri" w:hAnsi="Calibri"/>
+              </w:rPr>
+              <w:t xml:space="preserve">Component</w:t>
+            </w:r>
+          </w:p>
+        </w:tc>
+        <w:tc>
+          <w:tcPr>
+            <w:tcW w:w="3000" w:type="dxa"/>
+            <w:shd w:val="clear" w:fill="0632A0"/>
+          </w:tcPr>
+          <w:p>
+            <w:pPr>
+              <w:spacing w:after="20"/>
+            </w:pPr>
+            <w:r>
+              <w:rPr>
+                <w:b/>
+                <w:color w:val="FFFFFF"/>
+                <w:sz w:val="20"/>
+                <w:rFonts w:ascii="Calibri" w:hAnsi="Calibri"/>
+              </w:rPr>
+              <w:t xml:space="preserve">Pricing model</w:t>
+            </w:r>
+          </w:p>
+        </w:tc>
+        <w:tc>
+          <w:tcPr>
+            <w:tcW w:w="2560" w:type="dxa"/>
+            <w:shd w:val="clear" w:fill="0632A0"/>
+          </w:tcPr>
+          <w:p>
+            <w:pPr>
+              <w:spacing w:after="20"/>
+            </w:pPr>
+            <w:r>
+              <w:rPr>
+                <w:b/>
+                <w:color w:val="FFFFFF"/>
+                <w:sz w:val="20"/>
+                <w:rFonts w:ascii="Calibri" w:hAnsi="Calibri"/>
+              </w:rPr>
+              <w:t xml:space="preserve">Notes</w:t>
+            </w:r>
+          </w:p>
+        </w:tc>
+      </w:tr>
+      <w:tr>
+        <w:tc>
+          <w:tcPr>
+            <w:tcW w:w="3800" w:type="dxa"/>
+            <w:shd w:val="clear" w:fill="F4F7FC"/>
+          </w:tcPr>
+          <w:p>
+            <w:pPr>
+              <w:spacing w:after="20"/>
+            </w:pPr>
+            <w:r>
+              <w:rPr>
+                <w:color w:val="16203A"/>
+                <w:sz w:val="20"/>
+                <w:rFonts w:ascii="Calibri" w:hAnsi="Calibri"/>
+              </w:rPr>
+              <w:t xml:space="preserve">Autonomous AI Database 26ai (ADB, ECPU)</w:t>
+            </w:r>
+          </w:p>
+        </w:tc>
+        <w:tc>
+          <w:tcPr>
+            <w:tcW w:w="3000" w:type="dxa"/>
+            <w:shd w:val="clear" w:fill="F4F7FC"/>
+          </w:tcPr>
+          <w:p>
+            <w:pPr>
+              <w:spacing w:after="20"/>
+            </w:pPr>
+            <w:r>
+              <w:rPr>
+                <w:color w:val="16203A"/>
+                <w:sz w:val="20"/>
+                <w:rFonts w:ascii="Calibri" w:hAnsi="Calibri"/>
+              </w:rPr>
+              <w:t xml:space="preserve">License Included or BYOL (~76% lower)</w:t>
+            </w:r>
+          </w:p>
+        </w:tc>
+        <w:tc>
+          <w:tcPr>
+            <w:tcW w:w="2560" w:type="dxa"/>
+            <w:shd w:val="clear" w:fill="F4F7FC"/>
+          </w:tcPr>
+          <w:p>
+            <w:pPr>
+              <w:spacing w:after="20"/>
+            </w:pPr>
+            <w:r>
+              <w:rPr>
+                <w:color w:val="16203A"/>
+                <w:sz w:val="20"/>
+                <w:rFonts w:ascii="Calibri" w:hAnsi="Calibri"/>
+              </w:rPr>
+              <w:t xml:space="preserve">PAF sidecar host</w:t>
+            </w:r>
+          </w:p>
+        </w:tc>
+      </w:tr>
+      <w:tr>
+        <w:tc>
+          <w:tcPr>
+            <w:tcW w:w="3800" w:type="dxa"/>
+            <w:shd w:val="clear" w:fill="F4F7FC"/>
+          </w:tcPr>
+          <w:p>
+            <w:pPr>
+              <w:spacing w:after="20"/>
+            </w:pPr>
+            <w:r>
+              <w:rPr>
+                <w:color w:val="16203A"/>
+                <w:sz w:val="20"/>
+                <w:rFonts w:ascii="Calibri" w:hAnsi="Calibri"/>
+              </w:rPr>
+              <w:t xml:space="preserve">Oracle Private Agent Factory</w:t>
+            </w:r>
+          </w:p>
+        </w:tc>
+        <w:tc>
+          <w:tcPr>
+            <w:tcW w:w="3000" w:type="dxa"/>
+            <w:shd w:val="clear" w:fill="F4F7FC"/>
+          </w:tcPr>
+          <w:p>
+            <w:pPr>
+              <w:spacing w:after="20"/>
+            </w:pPr>
+            <w:r>
+              <w:rPr>
+                <w:color w:val="16203A"/>
+                <w:sz w:val="20"/>
+                <w:rFonts w:ascii="Calibri" w:hAnsi="Calibri"/>
+              </w:rPr>
+              <w:t xml:space="preserve">$0</w:t>
+            </w:r>
+          </w:p>
+        </w:tc>
+        <w:tc>
+          <w:tcPr>
+            <w:tcW w:w="2560" w:type="dxa"/>
+            <w:shd w:val="clear" w:fill="F4F7FC"/>
+          </w:tcPr>
+          <w:p>
+            <w:pPr>
+              <w:spacing w:after="20"/>
+            </w:pPr>
+            <w:r>
+              <w:rPr>
+                <w:color w:val="16203A"/>
+                <w:sz w:val="20"/>
+                <w:rFonts w:ascii="Calibri" w:hAnsi="Calibri"/>
+              </w:rPr>
+              <w:t xml:space="preserve">included with AI Database 26ai</w:t>
+            </w:r>
+          </w:p>
+        </w:tc>
+      </w:tr>
+      <w:tr>
+        <w:tc>
+          <w:tcPr>
+            <w:tcW w:w="3800" w:type="dxa"/>
+            <w:shd w:val="clear" w:fill="F4F7FC"/>
+          </w:tcPr>
+          <w:p>
+            <w:pPr>
+              <w:spacing w:after="20"/>
+            </w:pPr>
+            <w:r>
+              <w:rPr>
+                <w:color w:val="16203A"/>
+                <w:sz w:val="20"/>
+                <w:rFonts w:ascii="Calibri" w:hAnsi="Calibri"/>
+              </w:rPr>
+              <w:t xml:space="preserve">OCI Database Tools / Managed MCP</w:t>
+            </w:r>
+          </w:p>
+        </w:tc>
+        <w:tc>
+          <w:tcPr>
+            <w:tcW w:w="3000" w:type="dxa"/>
+            <w:shd w:val="clear" w:fill="F4F7FC"/>
+          </w:tcPr>
+          <w:p>
+            <w:pPr>
+              <w:spacing w:after="20"/>
+            </w:pPr>
+            <w:r>
+              <w:rPr>
+                <w:color w:val="16203A"/>
+                <w:sz w:val="20"/>
+                <w:rFonts w:ascii="Calibri" w:hAnsi="Calibri"/>
+              </w:rPr>
+              <w:t xml:space="preserve">consumption (confirm at install)</w:t>
+            </w:r>
+          </w:p>
+        </w:tc>
+        <w:tc>
+          <w:tcPr>
+            <w:tcW w:w="2560" w:type="dxa"/>
+            <w:shd w:val="clear" w:fill="F4F7FC"/>
+          </w:tcPr>
+          <w:p>
+            <w:pPr>
+              <w:spacing w:after="20"/>
+            </w:pPr>
+            <w:r>
+              <w:rPr>
+                <w:color w:val="16203A"/>
+                <w:sz w:val="20"/>
+                <w:rFonts w:ascii="Calibri" w:hAnsi="Calibri"/>
+              </w:rPr>
+              <w:t xml:space="preserve">replaces self-hosted broker</w:t>
+            </w:r>
+          </w:p>
+        </w:tc>
+      </w:tr>
+      <w:tr>
+        <w:tc>
+          <w:tcPr>
+            <w:tcW w:w="3800" w:type="dxa"/>
+            <w:shd w:val="clear" w:fill="F4F7FC"/>
+          </w:tcPr>
+          <w:p>
+            <w:pPr>
+              <w:spacing w:after="20"/>
+            </w:pPr>
+            <w:r>
+              <w:rPr>
+                <w:color w:val="16203A"/>
+                <w:sz w:val="20"/>
+                <w:rFonts w:ascii="Calibri" w:hAnsi="Calibri"/>
+              </w:rPr>
+              <w:t xml:space="preserve">OCI Generative AI</w:t>
+            </w:r>
+          </w:p>
+        </w:tc>
+        <w:tc>
+          <w:tcPr>
+            <w:tcW w:w="3000" w:type="dxa"/>
+            <w:shd w:val="clear" w:fill="F4F7FC"/>
+          </w:tcPr>
+          <w:p>
+            <w:pPr>
+              <w:spacing w:after="20"/>
+            </w:pPr>
+            <w:r>
+              <w:rPr>
+                <w:color w:val="16203A"/>
+                <w:sz w:val="20"/>
+                <w:rFonts w:ascii="Calibri" w:hAnsi="Calibri"/>
+              </w:rPr>
+              <w:t xml:space="preserve">per-token</w:t>
+            </w:r>
+          </w:p>
+        </w:tc>
+        <w:tc>
+          <w:tcPr>
+            <w:tcW w:w="2560" w:type="dxa"/>
+            <w:shd w:val="clear" w:fill="F4F7FC"/>
+          </w:tcPr>
+          <w:p>
+            <w:pPr>
+              <w:spacing w:after="20"/>
+            </w:pPr>
+            <w:r>
+              <w:rPr>
+                <w:color w:val="16203A"/>
+                <w:sz w:val="20"/>
+                <w:rFonts w:ascii="Calibri" w:hAnsi="Calibri"/>
+              </w:rPr>
+              <w:t xml:space="preserve">model-dependent (extraction)</w:t>
+            </w:r>
+          </w:p>
+        </w:tc>
+      </w:tr>
+      <w:tr>
+        <w:tc>
+          <w:tcPr>
+            <w:tcW w:w="3800" w:type="dxa"/>
+            <w:shd w:val="clear" w:fill="F4F7FC"/>
+          </w:tcPr>
+          <w:p>
+            <w:pPr>
+              <w:spacing w:after="20"/>
+            </w:pPr>
+            <w:r>
+              <w:rPr>
+                <w:color w:val="16203A"/>
+                <w:sz w:val="20"/>
+                <w:rFonts w:ascii="Calibri" w:hAnsi="Calibri"/>
+              </w:rPr>
+              <w:t xml:space="preserve">OCI Document Understanding (OCR)</w:t>
+            </w:r>
+          </w:p>
+        </w:tc>
+        <w:tc>
+          <w:tcPr>
+            <w:tcW w:w="3000" w:type="dxa"/>
+            <w:shd w:val="clear" w:fill="F4F7FC"/>
+          </w:tcPr>
+          <w:p>
+            <w:pPr>
+              <w:spacing w:after="20"/>
+            </w:pPr>
+            <w:r>
+              <w:rPr>
+                <w:color w:val="16203A"/>
+                <w:sz w:val="20"/>
+                <w:rFonts w:ascii="Calibri" w:hAnsi="Calibri"/>
+              </w:rPr>
+              <w:t xml:space="preserve">per-page (optional)</w:t>
+            </w:r>
+          </w:p>
+        </w:tc>
+        <w:tc>
+          <w:tcPr>
+            <w:tcW w:w="2560" w:type="dxa"/>
+            <w:shd w:val="clear" w:fill="F4F7FC"/>
+          </w:tcPr>
+          <w:p>
+            <w:pPr>
+              <w:spacing w:after="20"/>
+            </w:pPr>
+            <w:r>
+              <w:rPr>
+                <w:color w:val="16203A"/>
+                <w:sz w:val="20"/>
+                <w:rFonts w:ascii="Calibri" w:hAnsi="Calibri"/>
+              </w:rPr>
+              <w:t xml:space="preserve">only if PDF/scan ingestion</w:t>
+            </w:r>
+          </w:p>
+        </w:tc>
+      </w:tr>
+      <w:tr>
+        <w:tc>
+          <w:tcPr>
+            <w:tcW w:w="3800" w:type="dxa"/>
+            <w:shd w:val="clear" w:fill="F4F7FC"/>
+          </w:tcPr>
+          <w:p>
+            <w:pPr>
+              <w:spacing w:after="20"/>
+            </w:pPr>
+            <w:r>
+              <w:rPr>
+                <w:color w:val="16203A"/>
+                <w:sz w:val="20"/>
+                <w:rFonts w:ascii="Calibri" w:hAnsi="Calibri"/>
+              </w:rPr>
+              <w:t xml:space="preserve">Compute / storage / networking</w:t>
+            </w:r>
+          </w:p>
+        </w:tc>
+        <w:tc>
+          <w:tcPr>
+            <w:tcW w:w="3000" w:type="dxa"/>
+            <w:shd w:val="clear" w:fill="F4F7FC"/>
+          </w:tcPr>
+          <w:p>
+            <w:pPr>
+              <w:spacing w:after="20"/>
+            </w:pPr>
+            <w:r>
+              <w:rPr>
+                <w:color w:val="16203A"/>
+                <w:sz w:val="20"/>
+                <w:rFonts w:ascii="Calibri" w:hAnsi="Calibri"/>
+              </w:rPr>
+              <w:t xml:space="preserve">consumption</w:t>
+            </w:r>
+          </w:p>
+        </w:tc>
+        <w:tc>
+          <w:tcPr>
+            <w:tcW w:w="2560" w:type="dxa"/>
+            <w:shd w:val="clear" w:fill="F4F7FC"/>
+          </w:tcPr>
+          <w:p>
+            <w:pPr>
+              <w:spacing w:after="20"/>
+            </w:pPr>
+            <w:r>
+              <w:rPr>
+                <w:color w:val="16203A"/>
+                <w:sz w:val="20"/>
+                <w:rFonts w:ascii="Calibri" w:hAnsi="Calibri"/>
+              </w:rPr>
+              <w:t xml:space="preserve">no broker VM; no Instant Client host</w:t>
+            </w:r>
+          </w:p>
+        </w:tc>
+      </w:tr>
+      <w:tr>
+        <w:tc>
+          <w:tcPr>
+            <w:tcW w:w="3800" w:type="dxa"/>
+            <w:shd w:val="clear" w:fill="F4F7FC"/>
+          </w:tcPr>
+          <w:p>
+            <w:pPr>
+              <w:spacing w:after="20"/>
+            </w:pPr>
+            <w:r>
+              <w:rPr>
+                <w:color w:val="16203A"/>
+                <w:sz w:val="20"/>
+                <w:rFonts w:ascii="Calibri" w:hAnsi="Calibri"/>
+              </w:rPr>
+              <w:t xml:space="preserve">EBS 19c (OCI DBaaS/Exadata)</w:t>
+            </w:r>
+          </w:p>
+        </w:tc>
+        <w:tc>
+          <w:tcPr>
+            <w:tcW w:w="3000" w:type="dxa"/>
+            <w:shd w:val="clear" w:fill="F4F7FC"/>
+          </w:tcPr>
+          <w:p>
+            <w:pPr>
+              <w:spacing w:after="20"/>
+            </w:pPr>
+            <w:r>
+              <w:rPr>
+                <w:color w:val="16203A"/>
+                <w:sz w:val="20"/>
+                <w:rFonts w:ascii="Calibri" w:hAnsi="Calibri"/>
+              </w:rPr>
+              <w:t xml:space="preserve">customer existing license</w:t>
+            </w:r>
+          </w:p>
+        </w:tc>
+        <w:tc>
+          <w:tcPr>
+            <w:tcW w:w="2560" w:type="dxa"/>
+            <w:shd w:val="clear" w:fill="F4F7FC"/>
+          </w:tcPr>
+          <w:p>
+            <w:pPr>
+              <w:spacing w:after="20"/>
+            </w:pPr>
+            <w:r>
+              <w:rPr>
+                <w:color w:val="16203A"/>
+                <w:sz w:val="20"/>
+                <w:rFonts w:ascii="Calibri" w:hAnsi="Calibri"/>
+              </w:rPr>
+              <w:t xml:space="preserve">system of record + XXPAF logic</w:t>
+            </w:r>
+          </w:p>
+        </w:tc>
+      </w:tr>
+    </w:tbl>
+    <w:p>
+      <w:pPr>
+        <w:spacing w:after="120"/>
+      </w:pPr>
+    </w:p>
+    <w:p>
+      <w:pPr>
+        <w:spacing w:after="120"/>
+      </w:pPr>
+      <w:r>
+        <w:rPr>
+          <w:b/>
+          <w:color w:val="0632A0"/>
+          <w:sz w:val="30"/>
+          <w:rFonts w:ascii="Calibri" w:hAnsi="Calibri"/>
+        </w:rPr>
+        <w:t xml:space="preserve">14. Acceptance &amp; assumptions</w:t>
       </w:r>
     </w:p>
     <w:p>
@@ -972,7 +3327,7 @@
           <w:sz w:val="22"/>
           <w:rFonts w:ascii="Calibri" w:hAnsi="Calibri"/>
         </w:rPr>
-        <w:t xml:space="preserve">Acceptance: a green live golden test plus a balanced interface load in customer UAT. This generic SOW shell is subject to the parties' MSA; have counsel review before use.</w:t>
+        <w:t xml:space="preserve">Acceptance: a green live golden test plus a balanced interface load in customer UAT.</w:t>
       </w:r>
     </w:p>
     <w:p>
@@ -985,7 +3340,21 @@
           <w:sz w:val="22"/>
           <w:rFonts w:ascii="Calibri" w:hAnsi="Calibri"/>
         </w:rPr>
-        <w:t xml:space="preserve"> </w:t>
+        <w:t xml:space="preserve">This generic SOW shell is subject to the parties' MSA; have counsel review before use.</w:t>
+      </w:r>
+    </w:p>
+    <w:p>
+      <w:pPr>
+        <w:spacing w:after="120"/>
+      </w:pPr>
+      <w:r>
+        <w:rPr>
+          <w:b/>
+          <w:color w:val="0632A0"/>
+          <w:sz w:val="30"/>
+          <w:rFonts w:ascii="Calibri" w:hAnsi="Calibri"/>
+        </w:rPr>
+        <w:t xml:space="preserve">15. Signatures</w:t>
       </w:r>
     </w:p>
     <w:tbl>

</xml_diff>